<commit_message>
feat(reports): allow extra inspectors under Submitted by
mapSignatures now emits sig_inspectors[] — the primary inspector
first, then each additional inspector whose trimmed name is
non-empty — alongside the existing flat sig_inspector_name/position
tags. All five recipes turn the two inspector runs ("NAME OF
INSPECTOR" / "Position/Designation of Inspector") into a
{#sig_inspectors}...{/sig_inspectors} loop spanning both paragraphs;
docxtemplater's paragraphLoop repeats both for each row, so extra
inspectors stack under the first inside the "Submitted by" cell.

SignatorySheet lets the inspector add/remove additional name +
position pairs under the primary inspector's fields; Generate trims
them and drops any row with a blank name.

Co-Authored-By: Claude Opus 5 <noreply@anthropic.com>
</commit_message>
<xml_diff>
--- a/assets/templates/air-monitoring.docx
+++ b/assets/templates/air-monitoring.docx
@@ -13173,22 +13173,22 @@
                 <w:sz w:val="20"/>
                 <w:szCs w:val="20"/>
               </w:rPr>
-              <w:t xml:space="preserve">{sig_inspector_name}</w:t>
-            </w:r>
-          </w:p>
-          <w:p>
-            <w:pPr>
-              <w:rPr>
-                <w:sz w:val="20"/>
-                <w:szCs w:val="20"/>
-              </w:rPr>
-            </w:pPr>
-            <w:r>
-              <w:rPr>
-                <w:sz w:val="20"/>
-                <w:szCs w:val="20"/>
-              </w:rPr>
-              <w:t xml:space="preserve">{sig_inspector_position}</w:t>
+              <w:t xml:space="preserve">{#sig_inspectors}{sig_inspector_name}</w:t>
+            </w:r>
+          </w:p>
+          <w:p>
+            <w:pPr>
+              <w:rPr>
+                <w:sz w:val="20"/>
+                <w:szCs w:val="20"/>
+              </w:rPr>
+            </w:pPr>
+            <w:r>
+              <w:rPr>
+                <w:sz w:val="20"/>
+                <w:szCs w:val="20"/>
+              </w:rPr>
+              <w:t xml:space="preserve">{sig_inspector_position}{/sig_inspectors}</w:t>
             </w:r>
           </w:p>
         </w:tc>

</xml_diff>

<commit_message>
fix(reports): repeat whole paragraphs for each inspector under Submitted by
docxtemplater expands {#sig_inspectors}…{/sig_inspectors} inline when the
tags sit inside the "NAME OF INSPECTOR"/"Position/Designation of Inspector"
runs rather than alone in their own paragraphs, so a second inspector's name
glued onto the first one's position instead of repeating both paragraphs.

Add insertBeforeParagraph (mirrors insertAfterParagraph) so the loop opener
can live in its own paragraph ahead of the name, move the closer after a
spacer paragraph following the position, and put the two replaceText ops
back to plain tags. Regenerate all five templates and strengthen the Water
render test to assert the Submitted-by cell's paragraph list directly.

Co-Authored-By: Claude Opus 5 <noreply@anthropic.com>
</commit_message>
<xml_diff>
--- a/assets/templates/air-monitoring.docx
+++ b/assets/templates/air-monitoring.docx
@@ -13158,6 +13158,11 @@
             </w:pPr>
           </w:p>
           <w:p>
+            <w:r>
+              <w:t>{#sig_inspectors}</w:t>
+            </w:r>
+          </w:p>
+          <w:p>
             <w:pPr>
               <w:rPr>
                 <w:b/>
@@ -13173,22 +13178,32 @@
                 <w:sz w:val="20"/>
                 <w:szCs w:val="20"/>
               </w:rPr>
-              <w:t xml:space="preserve">{#sig_inspectors}{sig_inspector_name}</w:t>
-            </w:r>
-          </w:p>
-          <w:p>
-            <w:pPr>
-              <w:rPr>
-                <w:sz w:val="20"/>
-                <w:szCs w:val="20"/>
-              </w:rPr>
-            </w:pPr>
-            <w:r>
-              <w:rPr>
-                <w:sz w:val="20"/>
-                <w:szCs w:val="20"/>
-              </w:rPr>
-              <w:t xml:space="preserve">{sig_inspector_position}{/sig_inspectors}</w:t>
+              <w:t xml:space="preserve">{sig_inspector_name}</w:t>
+            </w:r>
+          </w:p>
+          <w:p>
+            <w:pPr>
+              <w:rPr>
+                <w:sz w:val="20"/>
+                <w:szCs w:val="20"/>
+              </w:rPr>
+            </w:pPr>
+            <w:r>
+              <w:rPr>
+                <w:sz w:val="20"/>
+                <w:szCs w:val="20"/>
+              </w:rPr>
+              <w:t xml:space="preserve">{sig_inspector_position}</w:t>
+            </w:r>
+          </w:p>
+          <w:p>
+            <w:pPr>
+              <w:spacing w:after="0"/>
+            </w:pPr>
+          </w:p>
+          <w:p>
+            <w:r>
+              <w:t>{/sig_inspectors}</w:t>
             </w:r>
           </w:p>
         </w:tc>

</xml_diff>

<commit_message>
fix(reports): give each stacked inspector the form's signature space above the name
The "Submitted by" cell's two blank signature-space paragraphs sat outside
the sig_inspectors loop, so only the first inspector got them above their
name — every later stacked inspector only got the single spacer after the
previous one's position. Move the two blanks inside the loop (matching each
recipe's own paragraph pPr so line spacing stays put) and drop the trailing
spacer after Position, so every inspector renders identically to the printed
form. All five templates had exactly 2 blank paragraphs before "NAME OF
INSPECTOR" in the originals.

Adds a deleteEmptyParagraphsBefore op to docx-tag.js to pull those blanks out
from ahead of the loop's insertion point.

Co-Authored-By: Claude Opus 5 <noreply@anthropic.com>
</commit_message>
<xml_diff>
--- a/assets/templates/air-monitoring.docx
+++ b/assets/templates/air-monitoring.docx
@@ -13138,6 +13138,11 @@
             <w:tcW w:w="4691" w:type="dxa"/>
           </w:tcPr>
           <w:p>
+            <w:r>
+              <w:t>{#sig_inspectors}</w:t>
+            </w:r>
+          </w:p>
+          <w:p>
             <w:pPr>
               <w:rPr>
                 <w:b/>
@@ -13158,11 +13163,6 @@
             </w:pPr>
           </w:p>
           <w:p>
-            <w:r>
-              <w:t>{#sig_inspectors}</w:t>
-            </w:r>
-          </w:p>
-          <w:p>
             <w:pPr>
               <w:rPr>
                 <w:b/>
@@ -13195,11 +13195,6 @@
               </w:rPr>
               <w:t xml:space="preserve">{sig_inspector_position}</w:t>
             </w:r>
-          </w:p>
-          <w:p>
-            <w:pPr>
-              <w:spacing w:after="0"/>
-            </w:pPr>
           </w:p>
           <w:p>
             <w:r>

</xml_diff>